<commit_message>
Created piece 2 sib file and reorg
</commit_message>
<xml_diff>
--- a/Working Folder/[In Progress] 4 Raymond Mok Kin Yee 莫健儿 - Cycle of Destiny 圆来缘去/4 Raymond Mok Kin Yee 莫健儿 - Cycle of Destiny 圆来缘去 - Errata_v1.docx
+++ b/Working Folder/[In Progress] 4 Raymond Mok Kin Yee 莫健儿 - Cycle of Destiny 圆来缘去/4 Raymond Mok Kin Yee 莫健儿 - Cycle of Destiny 圆来缘去 - Errata_v1.docx
@@ -796,6 +796,12 @@
                 <w:rFonts w:ascii="Times" w:eastAsia="Times" w:hAnsi="Times" w:cs="Times"/>
               </w:rPr>
             </w:pPr>
+            <w:r>
+              <w:rPr>
+                <w:rFonts w:ascii="Times" w:eastAsia="Times" w:hAnsi="Times" w:cs="Times"/>
+              </w:rPr>
+              <w:t>C7</w:t>
+            </w:r>
           </w:p>
         </w:tc>
         <w:tc>
@@ -809,6 +815,12 @@
                 <w:rFonts w:ascii="Times" w:eastAsia="Times" w:hAnsi="Times" w:cs="Times"/>
               </w:rPr>
             </w:pPr>
+            <w:r>
+              <w:rPr>
+                <w:rFonts w:ascii="Times" w:eastAsia="Times" w:hAnsi="Times" w:cs="Times"/>
+              </w:rPr>
+              <w:t>GYSN2</w:t>
+            </w:r>
           </w:p>
         </w:tc>
         <w:tc>
@@ -821,6 +833,12 @@
                 <w:rFonts w:ascii="Times" w:eastAsia="Times" w:hAnsi="Times" w:cs="Times"/>
               </w:rPr>
             </w:pPr>
+            <w:r>
+              <w:rPr>
+                <w:rFonts w:ascii="Times" w:eastAsia="Times" w:hAnsi="Times" w:cs="Times"/>
+              </w:rPr>
+              <w:t>Should we hide these rests at the start, since the player will join based on GYSN 1 and not based on rhythm?</w:t>
+            </w:r>
           </w:p>
         </w:tc>
         <w:tc>

</xml_diff>